<commit_message>
Tanzania results with verified duties; update comparison chapter and methods
Design demand 16.0 -> 15.4 MW (MEG injection pumps 0.5 -> 0.05 MW). Case 3 CO2
55.2 kt (-45.7 % vs case 1); flexibility benefit 2.6 kt (4.5 % of case 2).
Explanation updated: one derated GT almost covers the platform, so a second GT
is needed in only 895 h with fixed demand, and the line pack limits shifting.
Carbon excise duty run (NOK 0.09/kg) gives the same CO2.
</commit_message>
<xml_diff>
--- a/docs/thesis/comparison.docx
+++ b/docs/thesis/comparison.docx
@@ -332,7 +332,7 @@
               <w:jc w:val="left"/>
             </w:pPr>
             <w:r>
-              <w:t xml:space="preserve">16.0 MW</w:t>
+              <w:t xml:space="preserve">15.4 MW</w:t>
             </w:r>
           </w:p>
         </w:tc>
@@ -370,7 +370,7 @@
               <w:jc w:val="left"/>
             </w:pPr>
             <w:r>
-              <w:t xml:space="preserve">export compressor, 11.2 MW (70 %)</w:t>
+              <w:t xml:space="preserve">export compressor, 11.2 MW (73 %)</w:t>
             </w:r>
           </w:p>
         </w:tc>
@@ -560,7 +560,7 @@
               <w:jc w:val="left"/>
             </w:pPr>
             <w:r>
-              <w:t xml:space="preserve">none</w:t>
+              <w:t xml:space="preserve">zero in the base case</w:t>
             </w:r>
           </w:p>
         </w:tc>
@@ -636,7 +636,7 @@
               <w:jc w:val="left"/>
             </w:pPr>
             <w:r>
-              <w:t xml:space="preserve">104.2</w:t>
+              <w:t xml:space="preserve">101.7</w:t>
             </w:r>
           </w:p>
         </w:tc>
@@ -674,7 +674,7 @@
               <w:jc w:val="left"/>
             </w:pPr>
             <w:r>
-              <w:t xml:space="preserve">60.7 (−41.8 %)</w:t>
+              <w:t xml:space="preserve">57.8 (−43.2 %)</w:t>
             </w:r>
           </w:p>
         </w:tc>
@@ -712,7 +712,7 @@
               <w:jc w:val="left"/>
             </w:pPr>
             <w:r>
-              <w:t xml:space="preserve">57.2 (−45.1 %)</w:t>
+              <w:t xml:space="preserve">55.2 (−45.7 %)</w:t>
             </w:r>
           </w:p>
         </w:tc>
@@ -750,7 +750,7 @@
               <w:jc w:val="left"/>
             </w:pPr>
             <w:r>
-              <w:t xml:space="preserve">56.8 (−45.5 %)</w:t>
+              <w:t xml:space="preserve">55.0 (−45.9 %)</w:t>
             </w:r>
           </w:p>
         </w:tc>
@@ -788,7 +788,7 @@
               <w:jc w:val="left"/>
             </w:pPr>
             <w:r>
-              <w:t xml:space="preserve">3.5 kt (5.7 %)</w:t>
+              <w:t xml:space="preserve">2.6 kt (4.5 %)</w:t>
             </w:r>
           </w:p>
         </w:tc>
@@ -826,7 +826,7 @@
               <w:jc w:val="left"/>
             </w:pPr>
             <w:r>
-              <w:t xml:space="preserve">1,399 → 119</w:t>
+              <w:t xml:space="preserve">895 → 13</w:t>
             </w:r>
           </w:p>
         </w:tc>
@@ -864,7 +864,7 @@
               <w:jc w:val="left"/>
             </w:pPr>
             <w:r>
-              <w:t xml:space="preserve">164 → 13</w:t>
+              <w:t xml:space="preserve">121 → 2</w:t>
             </w:r>
           </w:p>
         </w:tc>
@@ -902,7 +902,7 @@
               <w:jc w:val="left"/>
             </w:pPr>
             <w:r>
-              <w:t xml:space="preserve">7,176 → 4,720 (−34 %)</w:t>
+              <w:t xml:space="preserve">6,403 → 4,800 (−25 %)</w:t>
             </w:r>
           </w:p>
         </w:tc>
@@ -967,13 +967,13 @@
         <w:t xml:space="preserve"> </w:t>
       </w:r>
       <w:r>
-        <w:t xml:space="preserve">−41.8 % against −49.4 % with fixed demand (Figure 11, left). The weaker wind</w:t>
-      </w:r>
-      <w:r>
-        <w:t xml:space="preserve"> </w:t>
-      </w:r>
-      <w:r>
-        <w:t xml:space="preserve">delivers 58 GWh to the platform instead of 89 GWh, covering 42 % of the</w:t>
+        <w:t xml:space="preserve">−43.2 % against −49.4 % with fixed demand (Figure 11, left). The weaker wind</w:t>
+      </w:r>
+      <w:r>
+        <w:t xml:space="preserve"> </w:t>
+      </w:r>
+      <w:r>
+        <w:t xml:space="preserve">delivers 57 GWh to the platform instead of 89 GWh, covering 42 % of the</w:t>
       </w:r>
       <w:r>
         <w:t xml:space="preserve"> </w:t>
@@ -999,19 +999,19 @@
         <w:pStyle w:val="BodyText"/>
       </w:pPr>
       <w:r>
-        <w:t xml:space="preserve">Flexible scheduling adds a further 3.5 kt/yr (5.7 % of case 2) in Tanzania.</w:t>
-      </w:r>
-      <w:r>
-        <w:t xml:space="preserve"> </w:t>
-      </w:r>
-      <w:r>
-        <w:t xml:space="preserve">That is half the North Sea benefit in absolute terms and in relative terms,</w:t>
-      </w:r>
-      <w:r>
-        <w:t xml:space="preserve"> </w:t>
-      </w:r>
-      <w:r>
-        <w:t xml:space="preserve">but still clearly positive, and again with</w:t>
+        <w:t xml:space="preserve">Flexible scheduling adds a further 2.6 kt/yr (4.5 % of case 2) in Tanzania.</w:t>
+      </w:r>
+      <w:r>
+        <w:t xml:space="preserve"> </w:t>
+      </w:r>
+      <w:r>
+        <w:t xml:space="preserve">That is about a third of the North Sea benefit in absolute terms and less than</w:t>
+      </w:r>
+      <w:r>
+        <w:t xml:space="preserve"> </w:t>
+      </w:r>
+      <w:r>
+        <w:t xml:space="preserve">half in relative terms, but still clearly positive, and again with</w:t>
       </w:r>
       <w:r>
         <w:t xml:space="preserve"> </w:t>
@@ -1021,7 +1021,21 @@
           <w:bCs/>
           <w:b/>
         </w:rPr>
-        <w:t xml:space="preserve">no lost production</w:t>
+        <w:t xml:space="preserve">no lost</w:t>
+      </w:r>
+      <w:r>
+        <w:rPr>
+          <w:bCs/>
+          <w:b/>
+        </w:rPr>
+        <w:t xml:space="preserve"> </w:t>
+      </w:r>
+      <w:r>
+        <w:rPr>
+          <w:bCs/>
+          <w:b/>
+        </w:rPr>
+        <w:t xml:space="preserve">production</w:t>
       </w:r>
       <w:r>
         <w:t xml:space="preserve">: the gas</w:t>
@@ -1042,7 +1056,7 @@
         <w:t xml:space="preserve"> </w:t>
       </w:r>
       <w:r>
-        <w:t xml:space="preserve">adds only 0.4 kt at both sites.</w:t>
+        <w:t xml:space="preserve">adds only 0.2 kt in Tanzania and 0.4 kt in the North Sea.</w:t>
       </w:r>
     </w:p>
     <w:p>
@@ -1050,7 +1064,7 @@
         <w:pStyle w:val="BodyText"/>
       </w:pPr>
       <w:r>
-        <w:t xml:space="preserve">The case 1 emissions differ more than the fuel use does (53.6 against</w:t>
+        <w:t xml:space="preserve">The case 1 emissions differ more than the fuel use does (52.3 against</w:t>
       </w:r>
       <w:r>
         <w:t xml:space="preserve"> </w:t>
@@ -1137,13 +1151,13 @@
       </w:r>
     </w:p>
     <w:bookmarkEnd w:id="24"/>
-    <w:bookmarkStart w:id="28" w:name="same-mechanism-smaller-buffer"/>
+    <w:bookmarkStart w:id="28" w:name="same-mechanism-less-to-gain"/>
     <w:p>
       <w:pPr>
         <w:pStyle w:val="Heading2"/>
       </w:pPr>
       <w:r>
-        <w:t xml:space="preserve">3 Same mechanism, smaller buffer</w:t>
+        <w:t xml:space="preserve">3 Same mechanism, less to gain</w:t>
       </w:r>
     </w:p>
     <w:p>
@@ -1169,43 +1183,43 @@
         <w:t xml:space="preserve"> </w:t>
       </w:r>
       <w:r>
-        <w:t xml:space="preserve">low load. The hours with two GTs online fall from 1,399 to 119, the starts</w:t>
-      </w:r>
-      <w:r>
-        <w:t xml:space="preserve"> </w:t>
-      </w:r>
-      <w:r>
-        <w:t xml:space="preserve">from 164 to 13, and the GT low-load hours by 34 %, the same proportion as in</w:t>
-      </w:r>
-      <w:r>
-        <w:t xml:space="preserve"> </w:t>
-      </w:r>
-      <w:r>
-        <w:t xml:space="preserve">the North Sea (Table C1). The example week (Figure 12) shows how this works on</w:t>
-      </w:r>
-      <w:r>
-        <w:t xml:space="preserve"> </w:t>
-      </w:r>
-      <w:r>
-        <w:t xml:space="preserve">a gas platform. When the wind drops, the platform lowers its gas production to</w:t>
-      </w:r>
-      <w:r>
-        <w:t xml:space="preserve"> </w:t>
-      </w:r>
-      <w:r>
-        <w:t xml:space="preserve">about 70 % and pauses MEG regeneration. When the wind returns, it produces at</w:t>
-      </w:r>
-      <w:r>
-        <w:t xml:space="preserve"> </w:t>
-      </w:r>
-      <w:r>
-        <w:t xml:space="preserve">110 % to refill the pipeline. Production was above the sales rate in 4,314</w:t>
-      </w:r>
-      <w:r>
-        <w:t xml:space="preserve"> </w:t>
-      </w:r>
-      <w:r>
-        <w:t xml:space="preserve">hours and below it in 2,860 hours.</w:t>
+        <w:t xml:space="preserve">low load. In Tanzania, the hours with two GTs online fall from 895 to 13, the</w:t>
+      </w:r>
+      <w:r>
+        <w:t xml:space="preserve"> </w:t>
+      </w:r>
+      <w:r>
+        <w:t xml:space="preserve">starts from 121 to 2, and the GT low-load hours by 25 % (Table C1). The example</w:t>
+      </w:r>
+      <w:r>
+        <w:t xml:space="preserve"> </w:t>
+      </w:r>
+      <w:r>
+        <w:t xml:space="preserve">week (Figure 12) shows how this works on a gas platform. When the wind drops,</w:t>
+      </w:r>
+      <w:r>
+        <w:t xml:space="preserve"> </w:t>
+      </w:r>
+      <w:r>
+        <w:t xml:space="preserve">the platform lowers its gas production to about 70 % and pauses MEG</w:t>
+      </w:r>
+      <w:r>
+        <w:t xml:space="preserve"> </w:t>
+      </w:r>
+      <w:r>
+        <w:t xml:space="preserve">regeneration. When the wind returns, it produces at 110 % to refill the</w:t>
+      </w:r>
+      <w:r>
+        <w:t xml:space="preserve"> </w:t>
+      </w:r>
+      <w:r>
+        <w:t xml:space="preserve">pipeline. Production was above the sales rate in 4,192 hours and below it in</w:t>
+      </w:r>
+      <w:r>
+        <w:t xml:space="preserve"> </w:t>
+      </w:r>
+      <w:r>
+        <w:t xml:space="preserve">2,691 hours.</w:t>
       </w:r>
     </w:p>
     <w:p>
@@ -1213,79 +1227,140 @@
         <w:pStyle w:val="BodyText"/>
       </w:pPr>
       <w:r>
-        <w:t xml:space="preserve">The saving is smaller because the</w:t>
-      </w:r>
-      <w:r>
-        <w:t xml:space="preserve"> </w:t>
-      </w:r>
+        <w:t xml:space="preserve">The saving is smaller for two reasons.</w:t>
+      </w:r>
+    </w:p>
+    <w:p>
+      <w:pPr>
+        <w:numPr>
+          <w:ilvl w:val="0"/>
+          <w:numId w:val="1001"/>
+        </w:numPr>
+        <w:pStyle w:val="Compact"/>
+      </w:pPr>
       <w:r>
         <w:rPr>
           <w:bCs/>
           <w:b/>
         </w:rPr>
-        <w:t xml:space="preserve">energy buffer is much smaller</w:t>
-      </w:r>
-      <w:r>
-        <w:t xml:space="preserve">, not</w:t>
-      </w:r>
-      <w:r>
-        <w:t xml:space="preserve"> </w:t>
-      </w:r>
-      <w:r>
-        <w:t xml:space="preserve">because the power swing is. Cutting production to its minimum lowers the</w:t>
-      </w:r>
-      <w:r>
-        <w:t xml:space="preserve"> </w:t>
-      </w:r>
-      <w:r>
-        <w:t xml:space="preserve">Tanzanian demand by 6.2 MW (North Sea injection lever: 9.6 MW). But the line</w:t>
-      </w:r>
-      <w:r>
-        <w:t xml:space="preserve"> </w:t>
-      </w:r>
-      <w:r>
-        <w:t xml:space="preserve">pack holds only 3.6 h of full-rate production, which allows about</w:t>
-      </w:r>
-      <w:r>
-        <w:t xml:space="preserve"> </w:t>
-      </w:r>
-      <w:r>
-        <w:t xml:space="preserve">45 MWh of electricity to be postponed. The 48 h MEG tank adds only about</w:t>
-      </w:r>
-      <w:r>
-        <w:t xml:space="preserve"> </w:t>
-      </w:r>
-      <w:r>
-        <w:t xml:space="preserve">15 MWh, because regeneration uses just 0.3 MW. The North Sea injection</w:t>
-      </w:r>
-      <w:r>
-        <w:t xml:space="preserve"> </w:t>
-      </w:r>
-      <w:r>
-        <w:t xml:space="preserve">buffer of 72 h holds about 660 MWh. Tanzanian flexibility can therefore</w:t>
-      </w:r>
-      <w:r>
-        <w:t xml:space="preserve"> </w:t>
-      </w:r>
-      <w:r>
-        <w:t xml:space="preserve">bridge short lulls of a few hours but not the multi-day calms of the</w:t>
-      </w:r>
-      <w:r>
-        <w:t xml:space="preserve"> </w:t>
-      </w:r>
-      <w:r>
-        <w:t xml:space="preserve">north-east monsoon. In those calms the second turbine is still needed, and</w:t>
-      </w:r>
-      <w:r>
-        <w:t xml:space="preserve"> </w:t>
-      </w:r>
-      <w:r>
-        <w:t xml:space="preserve">wind curtailment falls by only 1.6 GWh (North Sea: 5.7 GWh).</w:t>
-      </w:r>
-    </w:p>
-    <w:p>
-      <w:pPr>
-        <w:pStyle w:val="BodyText"/>
+        <w:t xml:space="preserve">Less to avoid.</w:t>
+      </w:r>
+      <w:r>
+        <w:t xml:space="preserve"> </w:t>
+      </w:r>
+      <w:r>
+        <w:t xml:space="preserve">The Tanzanian design demand (15.4 MW) is only just</w:t>
+      </w:r>
+      <w:r>
+        <w:t xml:space="preserve"> </w:t>
+      </w:r>
+      <w:r>
+        <w:t xml:space="preserve">above what one derated GT can carry while holding 5 MW in reserve</w:t>
+      </w:r>
+      <w:r>
+        <w:t xml:space="preserve"> </w:t>
+      </w:r>
+      <w:r>
+        <w:t xml:space="preserve">(15.0 MW). Even with fixed demand, a second GT is therefore needed in</w:t>
+      </w:r>
+      <w:r>
+        <w:t xml:space="preserve"> </w:t>
+      </w:r>
+      <w:r>
+        <w:t xml:space="preserve">only 895 hours of the year, about half as often as in the North Sea</w:t>
+      </w:r>
+      <w:r>
+        <w:t xml:space="preserve"> </w:t>
+      </w:r>
+      <w:r>
+        <w:t xml:space="preserve">(1,702 h). Flexibility removes almost all of these hours at both sites,</w:t>
+      </w:r>
+      <w:r>
+        <w:t xml:space="preserve"> </w:t>
+      </w:r>
+      <w:r>
+        <w:t xml:space="preserve">but in Tanzania there are fewer to remove.</w:t>
+      </w:r>
+    </w:p>
+    <w:p>
+      <w:pPr>
+        <w:numPr>
+          <w:ilvl w:val="0"/>
+          <w:numId w:val="1001"/>
+        </w:numPr>
+        <w:pStyle w:val="Compact"/>
+      </w:pPr>
+      <w:r>
+        <w:rPr>
+          <w:bCs/>
+          <w:b/>
+        </w:rPr>
+        <w:t xml:space="preserve">A much smaller energy buffer.</w:t>
+      </w:r>
+      <w:r>
+        <w:t xml:space="preserve"> </w:t>
+      </w:r>
+      <w:r>
+        <w:t xml:space="preserve">Cutting production to its minimum lowers</w:t>
+      </w:r>
+      <w:r>
+        <w:t xml:space="preserve"> </w:t>
+      </w:r>
+      <w:r>
+        <w:t xml:space="preserve">the Tanzanian demand by 6.0 MW (North Sea injection lever: 9.6 MW). But</w:t>
+      </w:r>
+      <w:r>
+        <w:t xml:space="preserve"> </w:t>
+      </w:r>
+      <w:r>
+        <w:t xml:space="preserve">the line pack holds only 3.6 h of full-rate production, so only about</w:t>
+      </w:r>
+      <w:r>
+        <w:t xml:space="preserve"> </w:t>
+      </w:r>
+      <w:r>
+        <w:t xml:space="preserve">45 MWh of electricity can be postponed. The 48 h MEG tank adds about</w:t>
+      </w:r>
+      <w:r>
+        <w:t xml:space="preserve"> </w:t>
+      </w:r>
+      <w:r>
+        <w:t xml:space="preserve">5 MWh, because regeneration uses only 0.1 MW of electricity; its 1 MW of</w:t>
+      </w:r>
+      <w:r>
+        <w:t xml:space="preserve"> </w:t>
+      </w:r>
+      <w:r>
+        <w:t xml:space="preserve">heat comes from turbine waste heat, which is always in surplus. The North</w:t>
+      </w:r>
+      <w:r>
+        <w:t xml:space="preserve"> </w:t>
+      </w:r>
+      <w:r>
+        <w:t xml:space="preserve">Sea injection buffer of 72 h holds about 660 MWh. Tanzanian flexibility</w:t>
+      </w:r>
+      <w:r>
+        <w:t xml:space="preserve"> </w:t>
+      </w:r>
+      <w:r>
+        <w:t xml:space="preserve">can bridge short lulls of a few hours, but it cannot move much wind energy</w:t>
+      </w:r>
+      <w:r>
+        <w:t xml:space="preserve"> </w:t>
+      </w:r>
+      <w:r>
+        <w:t xml:space="preserve">from windy to calm periods. Wind curtailment therefore falls by only</w:t>
+      </w:r>
+      <w:r>
+        <w:t xml:space="preserve"> </w:t>
+      </w:r>
+      <w:r>
+        <w:t xml:space="preserve">1.6 GWh (North Sea: 5.7 GWh).</w:t>
+      </w:r>
+    </w:p>
+    <w:p>
+      <w:pPr>
+        <w:pStyle w:val="FirstParagraph"/>
       </w:pPr>
       <w:r>
         <w:t xml:space="preserve">The line-pack sensitivity confirms this (Figure 11, right; Figure 13).</w:t>
@@ -1399,43 +1474,43 @@
               <w:jc w:val="left"/>
             </w:pPr>
             <w:r>
-              <w:t xml:space="preserve">0.9 %</w:t>
-            </w:r>
-          </w:p>
-        </w:tc>
-        <w:tc>
-          <w:tcPr/>
-          <w:p>
-            <w:pPr>
-              <w:pStyle w:val="Compact"/>
-              <w:jc w:val="left"/>
-            </w:pPr>
-            <w:r>
-              <w:t xml:space="preserve">5.3 %</w:t>
-            </w:r>
-          </w:p>
-        </w:tc>
-        <w:tc>
-          <w:tcPr/>
-          <w:p>
-            <w:pPr>
-              <w:pStyle w:val="Compact"/>
-              <w:jc w:val="left"/>
-            </w:pPr>
-            <w:r>
-              <w:t xml:space="preserve">5.7 %</w:t>
-            </w:r>
-          </w:p>
-        </w:tc>
-        <w:tc>
-          <w:tcPr/>
-          <w:p>
-            <w:pPr>
-              <w:pStyle w:val="Compact"/>
-              <w:jc w:val="left"/>
-            </w:pPr>
-            <w:r>
-              <w:t xml:space="preserve">6.1 %</w:t>
+              <w:t xml:space="preserve">0.3 %</w:t>
+            </w:r>
+          </w:p>
+        </w:tc>
+        <w:tc>
+          <w:tcPr/>
+          <w:p>
+            <w:pPr>
+              <w:pStyle w:val="Compact"/>
+              <w:jc w:val="left"/>
+            </w:pPr>
+            <w:r>
+              <w:t xml:space="preserve">4.2 %</w:t>
+            </w:r>
+          </w:p>
+        </w:tc>
+        <w:tc>
+          <w:tcPr/>
+          <w:p>
+            <w:pPr>
+              <w:pStyle w:val="Compact"/>
+              <w:jc w:val="left"/>
+            </w:pPr>
+            <w:r>
+              <w:t xml:space="preserve">4.5 %</w:t>
+            </w:r>
+          </w:p>
+        </w:tc>
+        <w:tc>
+          <w:tcPr/>
+          <w:p>
+            <w:pPr>
+              <w:pStyle w:val="Compact"/>
+              <w:jc w:val="left"/>
+            </w:pPr>
+            <w:r>
+              <w:t xml:space="preserve">4.9 %</w:t>
             </w:r>
           </w:p>
         </w:tc>
@@ -1452,25 +1527,25 @@
         <w:t xml:space="preserve"> </w:t>
       </w:r>
       <w:r>
-        <w:t xml:space="preserve">disappears. The first 1.8 h of line pack gives most of the benefit: in the</w:t>
-      </w:r>
-      <w:r>
-        <w:t xml:space="preserve"> </w:t>
-      </w:r>
-      <w:r>
-        <w:t xml:space="preserve">North Sea, likewise, 24 h of injection deficit gave the full result. Allowing</w:t>
-      </w:r>
-      <w:r>
-        <w:t xml:space="preserve"> </w:t>
-      </w:r>
-      <w:r>
-        <w:t xml:space="preserve">a wider pipeline pressure swing, or adding a second buffer such as gas</w:t>
-      </w:r>
-      <w:r>
-        <w:t xml:space="preserve"> </w:t>
-      </w:r>
-      <w:r>
-        <w:t xml:space="preserve">storage, would raise the Tanzanian benefit only slowly.</w:t>
+        <w:t xml:space="preserve">disappears: 121 GT starts remain, as with fixed demand. The first 1.8 h of</w:t>
+      </w:r>
+      <w:r>
+        <w:t xml:space="preserve"> </w:t>
+      </w:r>
+      <w:r>
+        <w:t xml:space="preserve">line pack gives most of the benefit. In the North Sea, likewise, 24 h of</w:t>
+      </w:r>
+      <w:r>
+        <w:t xml:space="preserve"> </w:t>
+      </w:r>
+      <w:r>
+        <w:t xml:space="preserve">injection deficit gave the full result. Allowing a wider pipeline pressure</w:t>
+      </w:r>
+      <w:r>
+        <w:t xml:space="preserve"> </w:t>
+      </w:r>
+      <w:r>
+        <w:t xml:space="preserve">swing would raise the Tanzanian benefit only slowly.</w:t>
       </w:r>
     </w:p>
     <w:p>
@@ -1560,7 +1635,7 @@
       <w:pPr>
         <w:numPr>
           <w:ilvl w:val="0"/>
-          <w:numId w:val="1001"/>
+          <w:numId w:val="1002"/>
         </w:numPr>
         <w:pStyle w:val="Compact"/>
       </w:pPr>
@@ -1581,32 +1656,26 @@
         <w:t xml:space="preserve"> </w:t>
       </w:r>
       <w:r>
-        <w:t xml:space="preserve">are 67.4, 57.2, 52.0 and 48.7 kt/yr for one to four turbines. The</w:t>
-      </w:r>
-      <w:r>
-        <w:t xml:space="preserve"> </w:t>
-      </w:r>
-      <w:r>
-        <w:t xml:space="preserve">flexibility benefit shrinks from 4.4 kt with one turbine to 3.1 kt with</w:t>
-      </w:r>
-      <w:r>
-        <w:t xml:space="preserve"> </w:t>
-      </w:r>
-      <w:r>
-        <w:t xml:space="preserve">four, because a larger farm leaves fewer hours in which the wind is just</w:t>
-      </w:r>
-      <w:r>
-        <w:t xml:space="preserve"> </w:t>
-      </w:r>
-      <w:r>
-        <w:t xml:space="preserve">short of the demand.</w:t>
+        <w:t xml:space="preserve">are 64.5, 55.2, 50.3 and 47.3 kt/yr for one to four turbines. The</w:t>
+      </w:r>
+      <w:r>
+        <w:t xml:space="preserve"> </w:t>
+      </w:r>
+      <w:r>
+        <w:t xml:space="preserve">flexibility benefit stays at about 2.6–2.8 kt whatever the farm size,</w:t>
+      </w:r>
+      <w:r>
+        <w:t xml:space="preserve"> </w:t>
+      </w:r>
+      <w:r>
+        <w:t xml:space="preserve">because it is limited by the line pack, not by the wind.</w:t>
       </w:r>
     </w:p>
     <w:p>
       <w:pPr>
         <w:numPr>
           <w:ilvl w:val="0"/>
-          <w:numId w:val="1001"/>
+          <w:numId w:val="1002"/>
         </w:numPr>
         <w:pStyle w:val="Compact"/>
       </w:pPr>
@@ -1621,7 +1690,13 @@
         <w:t xml:space="preserve"> </w:t>
       </w:r>
       <w:r>
-        <w:t xml:space="preserve">have no effect (57.2 kt in all runs). The</w:t>
+        <w:t xml:space="preserve">have no effect (55.2 kt in all runs, including</w:t>
+      </w:r>
+      <w:r>
+        <w:t xml:space="preserve"> </w:t>
+      </w:r>
+      <w:r>
+        <w:t xml:space="preserve">the Tanzanian carbon excise duty of 2025, about NOK 0.09/kg). The</w:t>
       </w:r>
       <w:r>
         <w:t xml:space="preserve"> </w:t>
@@ -1646,7 +1721,7 @@
       <w:pPr>
         <w:numPr>
           <w:ilvl w:val="0"/>
-          <w:numId w:val="1001"/>
+          <w:numId w:val="1002"/>
         </w:numPr>
         <w:pStyle w:val="Compact"/>
       </w:pPr>
@@ -1667,14 +1742,14 @@
         <w:t xml:space="preserve"> </w:t>
       </w:r>
       <w:r>
-        <w:t xml:space="preserve">all of the benefit of wind (80.8 kt in case 2, 80.0 kt in case 3).</w:t>
+        <w:t xml:space="preserve">all of the benefit of wind (79.2 kt in case 2, 78.4 kt in case 3).</w:t>
       </w:r>
     </w:p>
     <w:p>
       <w:pPr>
         <w:numPr>
           <w:ilvl w:val="0"/>
-          <w:numId w:val="1001"/>
+          <w:numId w:val="1002"/>
         </w:numPr>
         <w:pStyle w:val="Compact"/>
       </w:pPr>
@@ -1711,32 +1786,38 @@
         <w:t xml:space="preserve"> </w:t>
       </w:r>
       <w:r>
-        <w:t xml:space="preserve">in Tanzania: it leaves 590 MWh of</w:t>
-      </w:r>
-      <w:r>
-        <w:t xml:space="preserve"> </w:t>
-      </w:r>
-      <w:r>
-        <w:t xml:space="preserve">demand unmet over the year. Long calms and a weak resource mean that a</w:t>
-      </w:r>
-      <w:r>
-        <w:t xml:space="preserve"> </w:t>
-      </w:r>
-      <w:r>
-        <w:t xml:space="preserve">battery of this size cannot bridge the start of a gas turbine. The result</w:t>
-      </w:r>
-      <w:r>
-        <w:t xml:space="preserve"> </w:t>
-      </w:r>
-      <w:r>
-        <w:t xml:space="preserve">(49.5 kt) is marked in Figure 13 and is not a valid design.</w:t>
+        <w:t xml:space="preserve">in Tanzania: it leaves 27 MWh of</w:t>
+      </w:r>
+      <w:r>
+        <w:t xml:space="preserve"> </w:t>
+      </w:r>
+      <w:r>
+        <w:t xml:space="preserve">demand unmet over the year and needs 215 GT starts. Long calms and a weak</w:t>
+      </w:r>
+      <w:r>
+        <w:t xml:space="preserve"> </w:t>
+      </w:r>
+      <w:r>
+        <w:t xml:space="preserve">resource mean that a battery of this size cannot always bridge the start</w:t>
+      </w:r>
+      <w:r>
+        <w:t xml:space="preserve"> </w:t>
+      </w:r>
+      <w:r>
+        <w:t xml:space="preserve">of a gas turbine. The result (46.4 kt) is marked in Figure 13 and is not a</w:t>
+      </w:r>
+      <w:r>
+        <w:t xml:space="preserve"> </w:t>
+      </w:r>
+      <w:r>
+        <w:t xml:space="preserve">valid design.</w:t>
       </w:r>
     </w:p>
     <w:p>
       <w:pPr>
         <w:numPr>
           <w:ilvl w:val="0"/>
-          <w:numId w:val="1001"/>
+          <w:numId w:val="1002"/>
         </w:numPr>
         <w:pStyle w:val="Compact"/>
       </w:pPr>
@@ -1757,7 +1838,7 @@
         <w:t xml:space="preserve"> </w:t>
       </w:r>
       <w:r>
-        <w:t xml:space="preserve">1.1 kt more but needs 64 starts instead of 13.</w:t>
+        <w:t xml:space="preserve">1.1 kt more but needs 45 starts instead of 2.</w:t>
       </w:r>
     </w:p>
     <w:p>
@@ -1853,7 +1934,7 @@
       <w:pPr>
         <w:numPr>
           <w:ilvl w:val="0"/>
-          <w:numId w:val="1002"/>
+          <w:numId w:val="1003"/>
         </w:numPr>
         <w:pStyle w:val="Compact"/>
       </w:pPr>
@@ -1883,7 +1964,7 @@
       <w:pPr>
         <w:numPr>
           <w:ilvl w:val="0"/>
-          <w:numId w:val="1002"/>
+          <w:numId w:val="1003"/>
         </w:numPr>
         <w:pStyle w:val="Compact"/>
       </w:pPr>
@@ -1906,25 +1987,31 @@
         <w:t xml:space="preserve"> </w:t>
       </w:r>
       <w:r>
-        <w:t xml:space="preserve">pack of its export pipeline, a few hours. The benefit is therefore about</w:t>
-      </w:r>
-      <w:r>
-        <w:t xml:space="preserve"> </w:t>
-      </w:r>
-      <w:r>
-        <w:t xml:space="preserve">half as large (5.7 % against 11 % of case 2 emissions).</w:t>
+        <w:t xml:space="preserve">pack of its export pipeline, a few hours. Because this platform also</w:t>
+      </w:r>
+      <w:r>
+        <w:t xml:space="preserve"> </w:t>
+      </w:r>
+      <w:r>
+        <w:t xml:space="preserve">needs a second turbine less often in the first place, the benefit is less</w:t>
+      </w:r>
+      <w:r>
+        <w:t xml:space="preserve"> </w:t>
+      </w:r>
+      <w:r>
+        <w:t xml:space="preserve">than half as large (4.5 % against 11 % of case 2 emissions).</w:t>
       </w:r>
     </w:p>
     <w:p>
       <w:pPr>
         <w:numPr>
           <w:ilvl w:val="0"/>
-          <w:numId w:val="1002"/>
+          <w:numId w:val="1003"/>
         </w:numPr>
         <w:pStyle w:val="Compact"/>
       </w:pPr>
       <w:r>
-        <w:t xml:space="preserve">Wind alone reduces emissions less in Tanzania (−42 % against −49 %), and</w:t>
+        <w:t xml:space="preserve">Wind alone reduces emissions less in Tanzania (−43 % against −49 %), and</w:t>
       </w:r>
       <w:r>
         <w:t xml:space="preserve"> </w:t>
@@ -1937,18 +2024,24 @@
       <w:pPr>
         <w:numPr>
           <w:ilvl w:val="0"/>
-          <w:numId w:val="1002"/>
+          <w:numId w:val="1003"/>
         </w:numPr>
         <w:pStyle w:val="Compact"/>
       </w:pPr>
       <w:r>
-        <w:t xml:space="preserve">Without a carbon price, wind and flexibility are justified in Tanzania by</w:t>
-      </w:r>
-      <w:r>
-        <w:t xml:space="preserve"> </w:t>
-      </w:r>
-      <w:r>
-        <w:t xml:space="preserve">the gas they save for sale, not by avoided CO2 cost.</w:t>
+        <w:t xml:space="preserve">With no carbon price, or with the small Tanzanian excise duty of 2025,</w:t>
+      </w:r>
+      <w:r>
+        <w:t xml:space="preserve"> </w:t>
+      </w:r>
+      <w:r>
+        <w:t xml:space="preserve">wind and flexibility are justified in Tanzania by the gas they save for</w:t>
+      </w:r>
+      <w:r>
+        <w:t xml:space="preserve"> </w:t>
+      </w:r>
+      <w:r>
+        <w:t xml:space="preserve">sale, not by avoided CO2 cost.</w:t>
       </w:r>
     </w:p>
     <w:p>
@@ -1978,13 +2071,34 @@
         <w:t xml:space="preserve"> </w:t>
       </w:r>
       <w:r>
-        <w:t xml:space="preserve">pipeline size and pressures, MEG and TEG duties and the gas turbine derating</w:t>
-      </w:r>
-      <w:r>
-        <w:t xml:space="preserve"> </w:t>
-      </w:r>
-      <w:r>
-        <w:t xml:space="preserve">are assumptions (50 of 115 parameters). No operating data are available for</w:t>
+        <w:t xml:space="preserve">pipeline size and pressures, and the production limits are assumptions. 43 of</w:t>
+      </w:r>
+      <w:r>
+        <w:t xml:space="preserve"> </w:t>
+      </w:r>
+      <w:r>
+        <w:t xml:space="preserve">115 parameters remain assumptions, 22 of them specific to Tanzania</w:t>
+      </w:r>
+      <w:r>
+        <w:t xml:space="preserve"> </w:t>
+      </w:r>
+      <w:r>
+        <w:t xml:space="preserve">(</w:t>
+      </w:r>
+      <w:r>
+        <w:rPr>
+          <w:rStyle w:val="VerbatimChar"/>
+        </w:rPr>
+        <w:t xml:space="preserve">docs/verification/tanzania_assumptions.md</w:t>
+      </w:r>
+      <w:r>
+        <w:t xml:space="preserve">). The TEG and MEG duties were</w:t>
+      </w:r>
+      <w:r>
+        <w:t xml:space="preserve"> </w:t>
+      </w:r>
+      <w:r>
+        <w:t xml:space="preserve">checked with NeqSim water-content calculations. No operating data are available for</w:t>
       </w:r>
       <w:r>
         <w:t xml:space="preserve"> </w:t>
@@ -2293,6 +2407,9 @@
     <w:abstractNumId w:val="991"/>
   </w:num>
   <w:num w:numId="1002">
+    <w:abstractNumId w:val="991"/>
+  </w:num>
+  <w:num w:numId="1003">
     <w:abstractNumId w:val="99411"/>
     <w:lvlOverride w:ilvl="0">
       <w:startOverride w:val="1"/>

</xml_diff>

<commit_message>
Tanzania results with the carbon duty base (CO2 unchanged; costs include NOK 0.09/kg)
</commit_message>
<xml_diff>
--- a/docs/thesis/comparison.docx
+++ b/docs/thesis/comparison.docx
@@ -560,7 +560,7 @@
               <w:jc w:val="left"/>
             </w:pPr>
             <w:r>
-              <w:t xml:space="preserve">zero in the base case</w:t>
+              <w:t xml:space="preserve">NOK 0.09/kg (2025 excise duty)</w:t>
             </w:r>
           </w:p>
         </w:tc>
@@ -826,7 +826,7 @@
               <w:jc w:val="left"/>
             </w:pPr>
             <w:r>
-              <w:t xml:space="preserve">895 → 13</w:t>
+              <w:t xml:space="preserve">894 → 10</w:t>
             </w:r>
           </w:p>
         </w:tc>
@@ -864,7 +864,7 @@
               <w:jc w:val="left"/>
             </w:pPr>
             <w:r>
-              <w:t xml:space="preserve">121 → 2</w:t>
+              <w:t xml:space="preserve">120 → 1</w:t>
             </w:r>
           </w:p>
         </w:tc>
@@ -902,7 +902,7 @@
               <w:jc w:val="left"/>
             </w:pPr>
             <w:r>
-              <w:t xml:space="preserve">6,403 → 4,800 (−25 %)</w:t>
+              <w:t xml:space="preserve">6,401 → 4,763 (−26 %)</w:t>
             </w:r>
           </w:p>
         </w:tc>
@@ -1183,13 +1183,13 @@
         <w:t xml:space="preserve"> </w:t>
       </w:r>
       <w:r>
-        <w:t xml:space="preserve">low load. In Tanzania, the hours with two GTs online fall from 895 to 13, the</w:t>
-      </w:r>
-      <w:r>
-        <w:t xml:space="preserve"> </w:t>
-      </w:r>
-      <w:r>
-        <w:t xml:space="preserve">starts from 121 to 2, and the GT low-load hours by 25 % (Table C1). The example</w:t>
+        <w:t xml:space="preserve">low load. In Tanzania, the hours with two GTs online fall from 894 to 10, the</w:t>
+      </w:r>
+      <w:r>
+        <w:t xml:space="preserve"> </w:t>
+      </w:r>
+      <w:r>
+        <w:t xml:space="preserve">starts from 120 to 1, and the GT low-load hours by 26 % (Table C1). The example</w:t>
       </w:r>
       <w:r>
         <w:t xml:space="preserve"> </w:t>
@@ -1213,13 +1213,13 @@
         <w:t xml:space="preserve"> </w:t>
       </w:r>
       <w:r>
-        <w:t xml:space="preserve">pipeline. Production was above the sales rate in 4,192 hours and below it in</w:t>
-      </w:r>
-      <w:r>
-        <w:t xml:space="preserve"> </w:t>
-      </w:r>
-      <w:r>
-        <w:t xml:space="preserve">2,691 hours.</w:t>
+        <w:t xml:space="preserve">pipeline. Production was above the sales rate in 4,287 hours and below it in</w:t>
+      </w:r>
+      <w:r>
+        <w:t xml:space="preserve"> </w:t>
+      </w:r>
+      <w:r>
+        <w:t xml:space="preserve">2,715 hours.</w:t>
       </w:r>
     </w:p>
     <w:p>
@@ -1267,7 +1267,7 @@
         <w:t xml:space="preserve"> </w:t>
       </w:r>
       <w:r>
-        <w:t xml:space="preserve">only 895 hours of the year, about half as often as in the North Sea</w:t>
+        <w:t xml:space="preserve">only 894 hours of the year, about half as often as in the North Sea</w:t>
       </w:r>
       <w:r>
         <w:t xml:space="preserve"> </w:t>
@@ -1527,7 +1527,7 @@
         <w:t xml:space="preserve"> </w:t>
       </w:r>
       <w:r>
-        <w:t xml:space="preserve">disappears: 121 GT starts remain, as with fixed demand. The first 1.8 h of</w:t>
+        <w:t xml:space="preserve">disappears: 122 GT starts remain, as with fixed demand. The first 1.8 h of</w:t>
       </w:r>
       <w:r>
         <w:t xml:space="preserve"> </w:t>
@@ -1690,13 +1690,13 @@
         <w:t xml:space="preserve"> </w:t>
       </w:r>
       <w:r>
-        <w:t xml:space="preserve">have no effect (55.2 kt in all runs, including</w:t>
-      </w:r>
-      <w:r>
-        <w:t xml:space="preserve"> </w:t>
-      </w:r>
-      <w:r>
-        <w:t xml:space="preserve">the Tanzanian carbon excise duty of 2025, about NOK 0.09/kg). The</w:t>
+        <w:t xml:space="preserve">have no effect (55.2 kt in all runs, from no</w:t>
+      </w:r>
+      <w:r>
+        <w:t xml:space="preserve"> </w:t>
+      </w:r>
+      <w:r>
+        <w:t xml:space="preserve">carbon price up to NOK 2/kg). The</w:t>
       </w:r>
       <w:r>
         <w:t xml:space="preserve"> </w:t>
@@ -1786,13 +1786,13 @@
         <w:t xml:space="preserve"> </w:t>
       </w:r>
       <w:r>
-        <w:t xml:space="preserve">in Tanzania: it leaves 27 MWh of</w:t>
-      </w:r>
-      <w:r>
-        <w:t xml:space="preserve"> </w:t>
-      </w:r>
-      <w:r>
-        <w:t xml:space="preserve">demand unmet over the year and needs 215 GT starts. Long calms and a weak</w:t>
+        <w:t xml:space="preserve">in Tanzania: it leaves 52 MWh of</w:t>
+      </w:r>
+      <w:r>
+        <w:t xml:space="preserve"> </w:t>
+      </w:r>
+      <w:r>
+        <w:t xml:space="preserve">demand unmet over the year and needs 217 GT starts. Long calms and a weak</w:t>
       </w:r>
       <w:r>
         <w:t xml:space="preserve"> </w:t>
@@ -1838,7 +1838,7 @@
         <w:t xml:space="preserve"> </w:t>
       </w:r>
       <w:r>
-        <w:t xml:space="preserve">1.1 kt more but needs 45 starts instead of 2.</w:t>
+        <w:t xml:space="preserve">1.1 kt more but needs 43 starts instead of 1.</w:t>
       </w:r>
     </w:p>
     <w:p>
@@ -2029,19 +2029,19 @@
         <w:pStyle w:val="Compact"/>
       </w:pPr>
       <w:r>
-        <w:t xml:space="preserve">With no carbon price, or with the small Tanzanian excise duty of 2025,</w:t>
-      </w:r>
-      <w:r>
-        <w:t xml:space="preserve"> </w:t>
-      </w:r>
-      <w:r>
-        <w:t xml:space="preserve">wind and flexibility are justified in Tanzania by the gas they save for</w:t>
-      </w:r>
-      <w:r>
-        <w:t xml:space="preserve"> </w:t>
-      </w:r>
-      <w:r>
-        <w:t xml:space="preserve">sale, not by avoided CO2 cost.</w:t>
+        <w:t xml:space="preserve">With the small Tanzanian excise duty of 2025 (about NOK 0.09/kg, about 5 %</w:t>
+      </w:r>
+      <w:r>
+        <w:t xml:space="preserve"> </w:t>
+      </w:r>
+      <w:r>
+        <w:t xml:space="preserve">of the Norwegian 2030 price), wind and flexibility are justified in Tanzania</w:t>
+      </w:r>
+      <w:r>
+        <w:t xml:space="preserve"> </w:t>
+      </w:r>
+      <w:r>
+        <w:t xml:space="preserve">mainly by the gas they save for sale, not by avoided CO2 cost.</w:t>
       </w:r>
     </w:p>
     <w:p>

</xml_diff>